<commit_message>
Relatório: link do repositório na identificação
Co-Authored-By: Claude Opus 5.5 <noreply@anthropic.com>
</commit_message>
<xml_diff>
--- a/t4-kafka/Relatorio_T2_Kafka.docx
+++ b/t4-kafka/Relatorio_T2_Kafka.docx
@@ -1653,7 +1653,18 @@
         <w:t>Repositório:</w:t>
       </w:r>
       <w:r>
-        <w:t xml:space="preserve"> [link do repositório Git].</w:t>
+        <w:t xml:space="preserve"> </w:t>
+      </w:r>
+      <w:hyperlink r:id="rId8" w:history="1">
+        <w:r>
+          <w:rPr>
+            <w:rStyle w:val="Hyperlink"/>
+          </w:rPr>
+          <w:t>https://github.com/IanMarcos7/sd-t2-kafka-kraft</w:t>
+        </w:r>
+      </w:hyperlink>
+      <w:r>
+        <w:t>.</w:t>
       </w:r>
     </w:p>
     <w:p>
@@ -1756,7 +1767,7 @@
                     <pic:cNvPicPr/>
                   </pic:nvPicPr>
                   <pic:blipFill>
-                    <a:blip r:embed="rId8"/>
+                    <a:blip r:embed="rId9"/>
                     <a:stretch>
                       <a:fillRect/>
                     </a:stretch>
@@ -3005,7 +3016,7 @@
                     <pic:cNvPicPr/>
                   </pic:nvPicPr>
                   <pic:blipFill>
-                    <a:blip r:embed="rId9"/>
+                    <a:blip r:embed="rId10"/>
                     <a:stretch>
                       <a:fillRect/>
                     </a:stretch>
@@ -5196,7 +5207,7 @@
                     <pic:cNvPicPr/>
                   </pic:nvPicPr>
                   <pic:blipFill>
-                    <a:blip r:embed="rId10"/>
+                    <a:blip r:embed="rId11"/>
                     <a:stretch>
                       <a:fillRect/>
                     </a:stretch>
@@ -7801,8 +7812,8 @@
       </w:r>
     </w:p>
     <w:sectPr>
-      <w:headerReference w:type="even" r:id="rId11"/>
-      <w:headerReference w:type="default" r:id="rId12"/>
+      <w:headerReference w:type="even" r:id="rId12"/>
+      <w:headerReference w:type="default" r:id="rId13"/>
       <w:pgSz w:w="12240" w:h="15840"/>
       <w:pgMar w:top="1440" w:right="1440" w:bottom="1440" w:left="1440" w:header="720" w:footer="720" w:gutter="0"/>
       <w:cols w:space="720"/>
@@ -8849,6 +8860,18 @@
     <w:unhideWhenUsed/>
     <w:rsid w:val="004D2642"/>
   </w:style>
+  <w:style w:type="character" w:styleId="MenoPendente">
+    <w:name w:val="Unresolved Mention"/>
+    <w:basedOn w:val="Fontepargpadro"/>
+    <w:uiPriority w:val="99"/>
+    <w:semiHidden/>
+    <w:unhideWhenUsed/>
+    <w:rsid w:val="00D914FB"/>
+    <w:rPr>
+      <w:color w:val="605E5C"/>
+      <w:shd w:val="clear" w:color="auto" w:fill="E1DFDD"/>
+    </w:rPr>
+  </w:style>
 </w:styles>
 </file>
 

</xml_diff>